<commit_message>
Refactor resume generation logic and update template structure for clarity
</commit_message>
<xml_diff>
--- a/templates/resume-template.docx
+++ b/templates/resume-template.docx
@@ -284,7 +284,7 @@
           <w:sz w:val="22"/>
           <w:szCs w:val="22"/>
         </w:rPr>
-        <w:t xml:space="preserve">OPEN SOURCE PROJECTS</w:t>
+        <w:t xml:space="preserve">PROJECTS</w:t>
       </w:r>
     </w:p>
     <w:p>
@@ -325,7 +325,33 @@
           <w:sz w:val="18"/>
           <w:szCs w:val="18"/>
         </w:rPr>
-        <w:t xml:space="preserve">{href}  ·  {tags}</w:t>
+        <w:t xml:space="preserve">{meta}</w:t>
+      </w:r>
+    </w:p>
+    <w:p>
+      <w:r>
+        <w:t xml:space="preserve">{#contributions}</w:t>
+      </w:r>
+    </w:p>
+    <w:p>
+      <w:pPr>
+        <w:pStyle w:val="ListParagraph"/>
+        <w:numPr>
+          <w:ilvl w:val="0"/>
+          <w:numId w:val="1"/>
+        </w:numPr>
+      </w:pPr>
+      <w:r>
+        <w:rPr>
+          <w:sz w:val="19"/>
+          <w:szCs w:val="19"/>
+        </w:rPr>
+        <w:t xml:space="preserve">{.}</w:t>
+      </w:r>
+    </w:p>
+    <w:p>
+      <w:r>
+        <w:t xml:space="preserve">{/contributions}</w:t>
       </w:r>
     </w:p>
     <w:p>

</xml_diff>